<commit_message>
POO S5 (Repaso C1): sintesis integradora + practica guiada (rigor). Corte 1 completo.
</commit_message>
<xml_diff>
--- a/05-week/optional-activity/pdf/Actividad-Semana05.docx
+++ b/05-week/optional-activity/pdf/Actividad-Semana05.docx
@@ -31,7 +31,7 @@
           <w:sz w:val="22"/>
           <w:szCs w:val="22"/>
         </w:rPr>
-        <w:t xml:space="preserve">Programación y Diseño Orientado a Objetos · Semana 5 · Guía de repaso del Corte 1</w:t>
+        <w:t xml:space="preserve">Programación y Diseño Orientado a Objetos · Semana 5 · Clase integradora del Corte 1</w:t>
       </w:r>
     </w:p>
     <w:tbl>
@@ -430,7 +430,7 @@
           <w:sz w:val="22"/>
           <w:szCs w:val="22"/>
         </w:rPr>
-        <w:t xml:space="preserve">Repasar clases, objetos, encapsulamiento y constructores.</w:t>
+        <w:t xml:space="preserve">Integrar todos los conceptos del Corte 1 en una clase robusta.</w:t>
       </w:r>
     </w:p>
     <w:p>
@@ -454,7 +454,7 @@
           <w:sz w:val="22"/>
           <w:szCs w:val="22"/>
         </w:rPr>
-        <w:t xml:space="preserve">Diseñar una clase completa y bien encapsulada.</w:t>
+        <w:t xml:space="preserve">Proteger una invariante mediante encapsulamiento y validación.</w:t>
       </w:r>
     </w:p>
     <w:p>
@@ -478,7 +478,7 @@
           <w:sz w:val="22"/>
           <w:szCs w:val="22"/>
         </w:rPr>
-        <w:t xml:space="preserve">Autoevaluar la preparación para el parcial.</w:t>
+        <w:t xml:space="preserve">Implementar representación e igualdad correctas.</w:t>
       </w:r>
     </w:p>
     <w:p>
@@ -512,7 +512,26 @@
           <w:sz w:val="22"/>
           <w:szCs w:val="22"/>
         </w:rPr>
-        <w:t xml:space="preserve">Diseña e implementa una clase a tu elección (p. ej. </w:t>
+        <w:t xml:space="preserve">Diseña e implementa </w:t>
+      </w:r>
+      <w:r>
+        <w:rPr>
+          <w:rFonts w:ascii="Times New Roman" w:hAnsi="Times New Roman" w:cs="Times New Roman"/>
+          <w:b/>
+          <w:color w:val="000000"/>
+          <w:sz w:val="22"/>
+          <w:szCs w:val="22"/>
+        </w:rPr>
+        <w:t xml:space="preserve">una</w:t>
+      </w:r>
+      <w:r>
+        <w:rPr>
+          <w:rFonts w:ascii="Times New Roman" w:hAnsi="Times New Roman" w:cs="Times New Roman"/>
+          <w:color w:val="000000"/>
+          <w:sz w:val="22"/>
+          <w:szCs w:val="22"/>
+        </w:rPr>
+        <w:t xml:space="preserve"> clase a tu elección (p. ej. </w:t>
       </w:r>
       <w:r>
         <w:rPr>
@@ -521,7 +540,7 @@
           <w:sz w:val="22"/>
           <w:szCs w:val="22"/>
         </w:rPr>
-        <w:t xml:space="preserve">Estudiante</w:t>
+        <w:t xml:space="preserve">CuentaBancaria</w:t>
       </w:r>
       <w:r>
         <w:rPr>
@@ -539,7 +558,7 @@
           <w:sz w:val="22"/>
           <w:szCs w:val="22"/>
         </w:rPr>
-        <w:t xml:space="preserve">Vehiculo</w:t>
+        <w:t xml:space="preserve">Termostato</w:t>
       </w:r>
       <w:r>
         <w:rPr>
@@ -566,7 +585,44 @@
           <w:sz w:val="22"/>
           <w:szCs w:val="22"/>
         </w:rPr>
-        <w:t xml:space="preserve">) que cumpla:</w:t>
+        <w:t xml:space="preserve">, </w:t>
+      </w:r>
+      <w:r>
+        <w:rPr>
+          <w:rFonts w:ascii="Consolas" w:hAnsi="Consolas" w:cs="Consolas"/>
+          <w:color w:val="000000"/>
+          <w:sz w:val="22"/>
+          <w:szCs w:val="22"/>
+        </w:rPr>
+        <w:t xml:space="preserve">Reserva</w:t>
+      </w:r>
+      <w:r>
+        <w:rPr>
+          <w:rFonts w:ascii="Times New Roman" w:hAnsi="Times New Roman" w:cs="Times New Roman"/>
+          <w:color w:val="000000"/>
+          <w:sz w:val="22"/>
+          <w:szCs w:val="22"/>
+        </w:rPr>
+        <w:t xml:space="preserve">) que cumpla </w:t>
+      </w:r>
+      <w:r>
+        <w:rPr>
+          <w:rFonts w:ascii="Times New Roman" w:hAnsi="Times New Roman" w:cs="Times New Roman"/>
+          <w:b/>
+          <w:color w:val="000000"/>
+          <w:sz w:val="22"/>
+          <w:szCs w:val="22"/>
+        </w:rPr>
+        <w:t xml:space="preserve">todo</w:t>
+      </w:r>
+      <w:r>
+        <w:rPr>
+          <w:rFonts w:ascii="Times New Roman" w:hAnsi="Times New Roman" w:cs="Times New Roman"/>
+          <w:color w:val="000000"/>
+          <w:sz w:val="22"/>
+          <w:szCs w:val="22"/>
+        </w:rPr>
+        <w:t xml:space="preserve"> lo siguiente:</w:t>
       </w:r>
     </w:p>
     <w:p>
@@ -586,30 +642,21 @@
       <w:r>
         <w:rPr>
           <w:rFonts w:ascii="Times New Roman" w:hAnsi="Times New Roman" w:cs="Times New Roman"/>
-          <w:color w:val="000000"/>
-          <w:sz w:val="22"/>
-          <w:szCs w:val="22"/>
-        </w:rPr>
-        <w:t xml:space="preserve">Atributos </w:t>
-      </w:r>
-      <w:r>
-        <w:rPr>
-          <w:rFonts w:ascii="Times New Roman" w:hAnsi="Times New Roman" w:cs="Times New Roman"/>
           <w:b/>
           <w:color w:val="000000"/>
           <w:sz w:val="22"/>
           <w:szCs w:val="22"/>
         </w:rPr>
-        <w:t xml:space="preserve">privados</w:t>
-      </w:r>
-      <w:r>
-        <w:rPr>
-          <w:rFonts w:ascii="Times New Roman" w:hAnsi="Times New Roman" w:cs="Times New Roman"/>
-          <w:color w:val="000000"/>
-          <w:sz w:val="22"/>
-          <w:szCs w:val="22"/>
-        </w:rPr>
-        <w:t xml:space="preserve"> (mínimo 3).</w:t>
+        <w:t xml:space="preserve">Encapsulamiento con invariante clara</w:t>
+      </w:r>
+      <w:r>
+        <w:rPr>
+          <w:rFonts w:ascii="Times New Roman" w:hAnsi="Times New Roman" w:cs="Times New Roman"/>
+          <w:color w:val="000000"/>
+          <w:sz w:val="22"/>
+          <w:szCs w:val="22"/>
+        </w:rPr>
+        <w:t xml:space="preserve"> (documenta la invariante en el README).</w:t>
       </w:r>
     </w:p>
     <w:p>
@@ -634,16 +681,16 @@
           <w:sz w:val="22"/>
           <w:szCs w:val="22"/>
         </w:rPr>
-        <w:t xml:space="preserve">Dos constructores</w:t>
-      </w:r>
-      <w:r>
-        <w:rPr>
-          <w:rFonts w:ascii="Times New Roman" w:hAnsi="Times New Roman" w:cs="Times New Roman"/>
-          <w:color w:val="000000"/>
-          <w:sz w:val="22"/>
-          <w:szCs w:val="22"/>
-        </w:rPr>
-        <w:t xml:space="preserve"> (vacío y parametrizado con </w:t>
+        <w:t xml:space="preserve">Atributo de solo lectura</w:t>
+      </w:r>
+      <w:r>
+        <w:rPr>
+          <w:rFonts w:ascii="Times New Roman" w:hAnsi="Times New Roman" w:cs="Times New Roman"/>
+          <w:color w:val="000000"/>
+          <w:sz w:val="22"/>
+          <w:szCs w:val="22"/>
+        </w:rPr>
+        <w:t xml:space="preserve"> (</w:t>
       </w:r>
       <w:r>
         <w:rPr>
@@ -652,16 +699,16 @@
           <w:sz w:val="22"/>
           <w:szCs w:val="22"/>
         </w:rPr>
-        <w:t xml:space="preserve">this()</w:t>
-      </w:r>
-      <w:r>
-        <w:rPr>
-          <w:rFonts w:ascii="Times New Roman" w:hAnsi="Times New Roman" w:cs="Times New Roman"/>
-          <w:color w:val="000000"/>
-          <w:sz w:val="22"/>
-          <w:szCs w:val="22"/>
-        </w:rPr>
-        <w:t xml:space="preserve">).</w:t>
+        <w:t xml:space="preserve">private final</w:t>
+      </w:r>
+      <w:r>
+        <w:rPr>
+          <w:rFonts w:ascii="Times New Roman" w:hAnsi="Times New Roman" w:cs="Times New Roman"/>
+          <w:color w:val="000000"/>
+          <w:sz w:val="22"/>
+          <w:szCs w:val="22"/>
+        </w:rPr>
+        <w:t xml:space="preserve">, con getter y sin setter) que actúe como identidad.</w:t>
       </w:r>
     </w:p>
     <w:p>
@@ -681,21 +728,31 @@
       <w:r>
         <w:rPr>
           <w:rFonts w:ascii="Times New Roman" w:hAnsi="Times New Roman" w:cs="Times New Roman"/>
-          <w:color w:val="000000"/>
-          <w:sz w:val="22"/>
-          <w:szCs w:val="22"/>
-        </w:rPr>
-        <w:t xml:space="preserve">Getters y al menos un </w:t>
-      </w:r>
-      <w:r>
-        <w:rPr>
-          <w:rFonts w:ascii="Times New Roman" w:hAnsi="Times New Roman" w:cs="Times New Roman"/>
           <w:b/>
           <w:color w:val="000000"/>
           <w:sz w:val="22"/>
           <w:szCs w:val="22"/>
         </w:rPr>
-        <w:t xml:space="preserve">setter con validación</w:t>
+        <w:t xml:space="preserve">Dos constructores</w:t>
+      </w:r>
+      <w:r>
+        <w:rPr>
+          <w:rFonts w:ascii="Times New Roman" w:hAnsi="Times New Roman" w:cs="Times New Roman"/>
+          <w:color w:val="000000"/>
+          <w:sz w:val="22"/>
+          <w:szCs w:val="22"/>
+        </w:rPr>
+        <w:t xml:space="preserve">: uno completo (con validación) y uno reducido que </w:t>
+      </w:r>
+      <w:r>
+        <w:rPr>
+          <w:rFonts w:ascii="Times New Roman" w:hAnsi="Times New Roman" w:cs="Times New Roman"/>
+          <w:b/>
+          <w:color w:val="000000"/>
+          <w:sz w:val="22"/>
+          <w:szCs w:val="22"/>
+        </w:rPr>
+        <w:t xml:space="preserve">delegue con `this()`</w:t>
       </w:r>
       <w:r>
         <w:rPr>
@@ -723,21 +780,22 @@
       </w:r>
       <w:r>
         <w:rPr>
-          <w:rFonts w:ascii="Consolas" w:hAnsi="Consolas" w:cs="Consolas"/>
-          <w:color w:val="000000"/>
-          <w:sz w:val="22"/>
-          <w:szCs w:val="22"/>
-        </w:rPr>
-        <w:t xml:space="preserve">toString()</w:t>
-      </w:r>
-      <w:r>
-        <w:rPr>
-          <w:rFonts w:ascii="Times New Roman" w:hAnsi="Times New Roman" w:cs="Times New Roman"/>
-          <w:color w:val="000000"/>
-          <w:sz w:val="22"/>
-          <w:szCs w:val="22"/>
-        </w:rPr>
-        <w:t xml:space="preserve"> sobrescrito.</w:t>
+          <w:rFonts w:ascii="Times New Roman" w:hAnsi="Times New Roman" w:cs="Times New Roman"/>
+          <w:b/>
+          <w:color w:val="000000"/>
+          <w:sz w:val="22"/>
+          <w:szCs w:val="22"/>
+        </w:rPr>
+        <w:t xml:space="preserve">Operaciones de dominio</w:t>
+      </w:r>
+      <w:r>
+        <w:rPr>
+          <w:rFonts w:ascii="Times New Roman" w:hAnsi="Times New Roman" w:cs="Times New Roman"/>
+          <w:color w:val="000000"/>
+          <w:sz w:val="22"/>
+          <w:szCs w:val="22"/>
+        </w:rPr>
+        <w:t xml:space="preserve"> validadas (no setters genéricos que rompan la invariante).</w:t>
       </w:r>
     </w:p>
     <w:p>
@@ -756,21 +814,112 @@
       </w:r>
       <w:r>
         <w:rPr>
+          <w:rFonts w:ascii="Times New Roman" w:hAnsi="Times New Roman" w:cs="Times New Roman"/>
+          <w:b/>
+          <w:color w:val="000000"/>
+          <w:sz w:val="22"/>
+          <w:szCs w:val="22"/>
+        </w:rPr>
+        <w:t xml:space="preserve">`toString()`</w:t>
+      </w:r>
+      <w:r>
+        <w:rPr>
+          <w:rFonts w:ascii="Times New Roman" w:hAnsi="Times New Roman" w:cs="Times New Roman"/>
+          <w:color w:val="000000"/>
+          <w:sz w:val="22"/>
+          <w:szCs w:val="22"/>
+        </w:rPr>
+        <w:t xml:space="preserve"> legible y </w:t>
+      </w:r>
+      <w:r>
+        <w:rPr>
+          <w:rFonts w:ascii="Times New Roman" w:hAnsi="Times New Roman" w:cs="Times New Roman"/>
+          <w:b/>
+          <w:color w:val="000000"/>
+          <w:sz w:val="22"/>
+          <w:szCs w:val="22"/>
+        </w:rPr>
+        <w:t xml:space="preserve">`equals`/`hashCode`</w:t>
+      </w:r>
+      <w:r>
+        <w:rPr>
+          <w:rFonts w:ascii="Times New Roman" w:hAnsi="Times New Roman" w:cs="Times New Roman"/>
+          <w:color w:val="000000"/>
+          <w:sz w:val="22"/>
+          <w:szCs w:val="22"/>
+        </w:rPr>
+        <w:t xml:space="preserve"> por la identidad.</w:t>
+      </w:r>
+    </w:p>
+    <w:p>
+      <w:pPr>
+        <w:spacing w:after="120" w:line="276" w:lineRule="auto"/>
+        <w:ind w:left="454" w:hanging="284"/>
+      </w:pPr>
+      <w:r>
+        <w:rPr>
+          <w:rFonts w:ascii="Times New Roman" w:hAnsi="Times New Roman" w:cs="Times New Roman"/>
+          <w:color w:val="000000"/>
+          <w:sz w:val="22"/>
+          <w:szCs w:val="22"/>
+        </w:rPr>
+        <w:t xml:space="preserve">6.	</w:t>
+      </w:r>
+      <w:r>
+        <w:rPr>
+          <w:rFonts w:ascii="Times New Roman" w:hAnsi="Times New Roman" w:cs="Times New Roman"/>
+          <w:b/>
+          <w:color w:val="000000"/>
+          <w:sz w:val="22"/>
+          <w:szCs w:val="22"/>
+        </w:rPr>
+        <w:t xml:space="preserve">`main`</w:t>
+      </w:r>
+      <w:r>
+        <w:rPr>
+          <w:rFonts w:ascii="Times New Roman" w:hAnsi="Times New Roman" w:cs="Times New Roman"/>
+          <w:color w:val="000000"/>
+          <w:sz w:val="22"/>
+          <w:szCs w:val="22"/>
+        </w:rPr>
+        <w:t xml:space="preserve"> que cree objetos, ejecute casos válidos e inválidos (incluidos </w:t>
+      </w:r>
+      <w:r>
+        <w:rPr>
+          <w:rFonts w:ascii="Times New Roman" w:hAnsi="Times New Roman" w:cs="Times New Roman"/>
+          <w:b/>
+          <w:color w:val="000000"/>
+          <w:sz w:val="22"/>
+          <w:szCs w:val="22"/>
+        </w:rPr>
+        <w:t xml:space="preserve">límites</w:t>
+      </w:r>
+      <w:r>
+        <w:rPr>
+          <w:rFonts w:ascii="Times New Roman" w:hAnsi="Times New Roman" w:cs="Times New Roman"/>
+          <w:color w:val="000000"/>
+          <w:sz w:val="22"/>
+          <w:szCs w:val="22"/>
+        </w:rPr>
+        <w:t xml:space="preserve">) y evidencie que la invariante nunca se viola; incluye una prueba con </w:t>
+      </w:r>
+      <w:r>
+        <w:rPr>
           <w:rFonts w:ascii="Consolas" w:hAnsi="Consolas" w:cs="Consolas"/>
           <w:color w:val="000000"/>
           <w:sz w:val="22"/>
           <w:szCs w:val="22"/>
         </w:rPr>
-        <w:t xml:space="preserve">main</w:t>
-      </w:r>
-      <w:r>
-        <w:rPr>
-          <w:rFonts w:ascii="Times New Roman" w:hAnsi="Times New Roman" w:cs="Times New Roman"/>
-          <w:color w:val="000000"/>
-          <w:sz w:val="22"/>
-          <w:szCs w:val="22"/>
-        </w:rPr>
-        <w:t xml:space="preserve"> que cree 3 objetos, los use y los imprima.</w:t>
+        <w:t xml:space="preserve">HashSet</w:t>
+      </w:r>
+      <w:r>
+        <w:rPr>
+          <w:rFonts w:ascii="Times New Roman" w:hAnsi="Times New Roman" w:cs="Times New Roman"/>
+          <w:color w:val="000000"/>
+          <w:sz w:val="22"/>
+          <w:szCs w:val="22"/>
+        </w:rPr>
+        <w:t xml:space="preserve">.</w:t>
       </w:r>
     </w:p>
     <w:p>
@@ -813,7 +962,7 @@
           <w:sz w:val="22"/>
           <w:szCs w:val="22"/>
         </w:rPr>
-        <w:t xml:space="preserve">Encapsulamiento correcto.</w:t>
+        <w:t xml:space="preserve">Todos los puntos 1–6, integrados y probados.</w:t>
       </w:r>
     </w:p>
     <w:p>
@@ -837,7 +986,7 @@
           <w:sz w:val="22"/>
           <w:szCs w:val="22"/>
         </w:rPr>
-        <w:t xml:space="preserve">Validación en al menos un setter.</w:t>
+        <w:t xml:space="preserve">Casos límite cubiertos.</w:t>
       </w:r>
     </w:p>
     <w:p>
@@ -861,7 +1010,7 @@
           <w:sz w:val="22"/>
           <w:szCs w:val="22"/>
         </w:rPr>
-        <w:t xml:space="preserve">Salida legible con toString.</w:t>
+        <w:t xml:space="preserve">README con: la invariante, decisiones de diseño y la salida de las pruebas.</w:t>
       </w:r>
     </w:p>
     <w:p>
@@ -923,7 +1072,7 @@
           <w:sz w:val="22"/>
           <w:szCs w:val="22"/>
         </w:rPr>
-        <w:t xml:space="preserve">poo-s05-repaso</w:t>
+        <w:t xml:space="preserve">poo-s05-integrador</w:t>
       </w:r>
       <w:r>
         <w:rPr>
@@ -948,7 +1097,7 @@
           <w:sz w:val="18"/>
           <w:szCs w:val="18"/>
         </w:rPr>
-        <w:t xml:space="preserve">poo-s05-repaso/</w:t>
+        <w:t xml:space="preserve">poo-s05-integrador/</w:t>
       </w:r>
     </w:p>
     <w:p>
@@ -964,7 +1113,7 @@
           <w:sz w:val="18"/>
           <w:szCs w:val="18"/>
         </w:rPr>
-        <w:t xml:space="preserve">  README.md   -&gt; descripcion + salida de ejemplo</w:t>
+        <w:t xml:space="preserve">  README.md   -&gt; invariante + decisiones + salida de pruebas</w:t>
       </w:r>
     </w:p>
     <w:p>
@@ -1004,7 +1153,7 @@
           <w:sz w:val="22"/>
           <w:szCs w:val="22"/>
         </w:rPr>
-        <w:t xml:space="preserve">Crea el repo público con ese nombre.</w:t>
+        <w:t xml:space="preserve">Crea el repositorio público con ese nombre.</w:t>
       </w:r>
     </w:p>
     <w:p>
@@ -1052,7 +1201,7 @@
           <w:sz w:val="22"/>
           <w:szCs w:val="22"/>
         </w:rPr>
-        <w:t xml:space="preserve">Comparte el enlace por el canal indicado.</w:t>
+        <w:t xml:space="preserve">Comparte el enlace por el canal indicado por el docente.</w:t>
       </w:r>
     </w:p>
     <w:p>
@@ -1135,7 +1284,7 @@
                 <w:sz w:val="20"/>
                 <w:szCs w:val="20"/>
               </w:rPr>
-              <w:t xml:space="preserve">Excelente</w:t>
+              <w:t xml:space="preserve">Excelente (100%)</w:t>
             </w:r>
           </w:p>
         </w:tc>
@@ -1157,7 +1306,7 @@
                 <w:sz w:val="20"/>
                 <w:szCs w:val="20"/>
               </w:rPr>
-              <w:t xml:space="preserve">Aceptable</w:t>
+              <w:t xml:space="preserve">Aceptable (60%)</w:t>
             </w:r>
           </w:p>
         </w:tc>
@@ -1179,7 +1328,7 @@
                 <w:sz w:val="20"/>
                 <w:szCs w:val="20"/>
               </w:rPr>
-              <w:t xml:space="preserve">Por mejorar</w:t>
+              <w:t xml:space="preserve">Por mejorar (0%)</w:t>
             </w:r>
           </w:p>
         </w:tc>
@@ -1223,7 +1372,7 @@
                 <w:sz w:val="20"/>
                 <w:szCs w:val="20"/>
               </w:rPr>
-              <w:t xml:space="preserve">Encapsulamiento</w:t>
+              <w:t xml:space="preserve">Encapsulamiento + invariante</w:t>
             </w:r>
           </w:p>
         </w:tc>
@@ -1243,7 +1392,7 @@
                 <w:sz w:val="20"/>
                 <w:szCs w:val="20"/>
               </w:rPr>
-              <w:t xml:space="preserve">Correcto</w:t>
+              <w:t xml:space="preserve">Protegida y documentada</w:t>
             </w:r>
           </w:p>
         </w:tc>
@@ -1283,7 +1432,7 @@
                 <w:sz w:val="20"/>
                 <w:szCs w:val="20"/>
               </w:rPr>
-              <w:t xml:space="preserve">Ausente</w:t>
+              <w:t xml:space="preserve">Ausente/violada</w:t>
             </w:r>
           </w:p>
         </w:tc>
@@ -1325,7 +1474,7 @@
                 <w:sz w:val="20"/>
                 <w:szCs w:val="20"/>
               </w:rPr>
-              <w:t xml:space="preserve">Constructores (con this())</w:t>
+              <w:t xml:space="preserve">Constructores (this() + validación)</w:t>
             </w:r>
           </w:p>
         </w:tc>
@@ -1405,7 +1554,7 @@
                 <w:sz w:val="20"/>
                 <w:szCs w:val="20"/>
               </w:rPr>
-              <w:t xml:space="preserve">25</w:t>
+              <w:t xml:space="preserve">20</w:t>
             </w:r>
           </w:p>
         </w:tc>
@@ -1427,7 +1576,7 @@
                 <w:sz w:val="20"/>
                 <w:szCs w:val="20"/>
               </w:rPr>
-              <w:t xml:space="preserve">Validación + toString</w:t>
+              <w:t xml:space="preserve">Atributo final de solo lectura</w:t>
             </w:r>
           </w:p>
         </w:tc>
@@ -1447,7 +1596,7 @@
                 <w:sz w:val="20"/>
                 <w:szCs w:val="20"/>
               </w:rPr>
-              <w:t xml:space="preserve">Correctos</w:t>
+              <w:t xml:space="preserve">Correcto</w:t>
             </w:r>
           </w:p>
         </w:tc>
@@ -1467,7 +1616,7 @@
                 <w:sz w:val="20"/>
                 <w:szCs w:val="20"/>
               </w:rPr>
-              <w:t xml:space="preserve">Con detalles</w:t>
+              <w:t xml:space="preserve">—</w:t>
             </w:r>
           </w:p>
         </w:tc>
@@ -1487,7 +1636,7 @@
                 <w:sz w:val="20"/>
                 <w:szCs w:val="20"/>
               </w:rPr>
-              <w:t xml:space="preserve">Ausentes</w:t>
+              <w:t xml:space="preserve">Ausente</w:t>
             </w:r>
           </w:p>
         </w:tc>
@@ -1507,7 +1656,7 @@
                 <w:sz w:val="20"/>
                 <w:szCs w:val="20"/>
               </w:rPr>
-              <w:t xml:space="preserve">30</w:t>
+              <w:t xml:space="preserve">10</w:t>
             </w:r>
           </w:p>
         </w:tc>
@@ -1529,7 +1678,7 @@
                 <w:sz w:val="20"/>
                 <w:szCs w:val="20"/>
               </w:rPr>
-              <w:t xml:space="preserve">main y casos de uso</w:t>
+              <w:t xml:space="preserve">toString + equals/hashCode</w:t>
             </w:r>
           </w:p>
         </w:tc>
@@ -1549,7 +1698,7 @@
                 <w:sz w:val="20"/>
                 <w:szCs w:val="20"/>
               </w:rPr>
-              <w:t xml:space="preserve">Claros</w:t>
+              <w:t xml:space="preserve">Coherentes y probados</w:t>
             </w:r>
           </w:p>
         </w:tc>
@@ -1569,7 +1718,7 @@
                 <w:sz w:val="20"/>
                 <w:szCs w:val="20"/>
               </w:rPr>
-              <w:t xml:space="preserve">Aceptables</w:t>
+              <w:t xml:space="preserve">Uno o sin probar</w:t>
             </w:r>
           </w:p>
         </w:tc>
@@ -1589,7 +1738,109 @@
                 <w:sz w:val="20"/>
                 <w:szCs w:val="20"/>
               </w:rPr>
-              <w:t xml:space="preserve">Deficientes</w:t>
+              <w:t xml:space="preserve">Incorrectos</w:t>
+            </w:r>
+          </w:p>
+        </w:tc>
+        <w:tc>
+          <w:tcPr>
+            <w:tcW w:w="0" w:type="auto"/>
+            <w:vAlign w:val="center"/>
+          </w:tcPr>
+          <w:p>
+            <w:pPr>
+              <w:spacing w:after="20" w:before="20"/>
+            </w:pPr>
+            <w:r>
+              <w:rPr>
+                <w:rFonts w:ascii="Times New Roman" w:hAnsi="Times New Roman" w:cs="Times New Roman"/>
+                <w:color w:val="000000"/>
+                <w:sz w:val="20"/>
+                <w:szCs w:val="20"/>
+              </w:rPr>
+              <w:t xml:space="preserve">25</w:t>
+            </w:r>
+          </w:p>
+        </w:tc>
+      </w:tr>
+      <w:tr>
+        <w:tc>
+          <w:tcPr>
+            <w:tcW w:w="0" w:type="auto"/>
+            <w:vAlign w:val="center"/>
+          </w:tcPr>
+          <w:p>
+            <w:pPr>
+              <w:spacing w:after="20" w:before="20"/>
+            </w:pPr>
+            <w:r>
+              <w:rPr>
+                <w:rFonts w:ascii="Times New Roman" w:hAnsi="Times New Roman" w:cs="Times New Roman"/>
+                <w:color w:val="000000"/>
+                <w:sz w:val="20"/>
+                <w:szCs w:val="20"/>
+              </w:rPr>
+              <w:t xml:space="preserve">main con casos límite + README</w:t>
+            </w:r>
+          </w:p>
+        </w:tc>
+        <w:tc>
+          <w:tcPr>
+            <w:tcW w:w="0" w:type="auto"/>
+            <w:vAlign w:val="center"/>
+          </w:tcPr>
+          <w:p>
+            <w:pPr>
+              <w:spacing w:after="20" w:before="20"/>
+            </w:pPr>
+            <w:r>
+              <w:rPr>
+                <w:rFonts w:ascii="Times New Roman" w:hAnsi="Times New Roman" w:cs="Times New Roman"/>
+                <w:color w:val="000000"/>
+                <w:sz w:val="20"/>
+                <w:szCs w:val="20"/>
+              </w:rPr>
+              <w:t xml:space="preserve">Completo y claro</w:t>
+            </w:r>
+          </w:p>
+        </w:tc>
+        <w:tc>
+          <w:tcPr>
+            <w:tcW w:w="0" w:type="auto"/>
+            <w:vAlign w:val="center"/>
+          </w:tcPr>
+          <w:p>
+            <w:pPr>
+              <w:spacing w:after="20" w:before="20"/>
+            </w:pPr>
+            <w:r>
+              <w:rPr>
+                <w:rFonts w:ascii="Times New Roman" w:hAnsi="Times New Roman" w:cs="Times New Roman"/>
+                <w:color w:val="000000"/>
+                <w:sz w:val="20"/>
+                <w:szCs w:val="20"/>
+              </w:rPr>
+              <w:t xml:space="preserve">Aceptable</w:t>
+            </w:r>
+          </w:p>
+        </w:tc>
+        <w:tc>
+          <w:tcPr>
+            <w:tcW w:w="0" w:type="auto"/>
+            <w:vAlign w:val="center"/>
+          </w:tcPr>
+          <w:p>
+            <w:pPr>
+              <w:spacing w:after="20" w:before="20"/>
+            </w:pPr>
+            <w:r>
+              <w:rPr>
+                <w:rFonts w:ascii="Times New Roman" w:hAnsi="Times New Roman" w:cs="Times New Roman"/>
+                <w:color w:val="000000"/>
+                <w:sz w:val="20"/>
+                <w:szCs w:val="20"/>
+              </w:rPr>
+              <w:t xml:space="preserve">Deficiente</w:t>
             </w:r>
           </w:p>
         </w:tc>
@@ -1628,7 +1879,7 @@
           <w:sz w:val="21"/>
           <w:szCs w:val="21"/>
         </w:rPr>
-        <w:t xml:space="preserve">Nota: actividad formativa y opcional (sin nota en Moodle). La guía unificada de entrega estará en el Manual de Entrega de Actividades Opcionales (próximamente).</w:t>
+        <w:t xml:space="preserve">Nota: actividad formativa y opcional (sin nota en Moodle). La guía unificada para entregar todas las actividades opcionales, válida para todas las materias, estará en el Manual de Entrega de Actividades Opcionales (próximamente).</w:t>
       </w:r>
     </w:p>
     <w:sectPr>

</xml_diff>